<commit_message>
docs: update repository clone URL and instructions
</commit_message>
<xml_diff>
--- a/docs/HUONG_DAN_DIEU_KHIEN_AGENT_DONG_BO.docx
+++ b/docs/HUONG_DAN_DIEU_KHIEN_AGENT_DONG_BO.docx
@@ -66,6 +66,14 @@
             </w:r>
             <w:r>
               <w:t>Hệ thống được thiết kế theo cơ chế GitOps tự động hóa 100%: Mỗi thành viên sở hữu 1 thư mục riêng, tự động nhận diện danh tính qua file 'identity.txt', tự động kéo code mới trước khi làm việc, tự động chặn sửa file của bạn mình và tự động hỏi đẩy code lên GitHub sau khi hoàn thành.</w:t>
+              <w:br/>
+            </w:r>
+            <w:r>
+              <w:rPr>
+                <w:b/>
+                <w:color w:val="0066CC"/>
+              </w:rPr>
+              <w:t>Repository chính thức: https://github.com/newiexk-cyber/ai-devsecops-agent.git</w:t>
             </w:r>
           </w:p>
         </w:tc>
@@ -260,7 +268,7 @@
               </w:rPr>
               <w:t>Mở Terminal (hoặc PowerShell), gõ lệnh:</w:t>
               <w:br/>
-              <w:t>git clone &lt;LINK_GITHUB_REPO_CỦA_LÂM&gt;</w:t>
+              <w:t>git clone https://github.com/newiexk-cyber/ai-devsecops-agent.git</w:t>
               <w:br/>
               <w:t>Sau đó mở Antigravity IDE -&gt; Chọn 'File -&gt; Open Folder' -&gt; Chọn thư mục dự án vừa clone.</w:t>
             </w:r>
@@ -1420,7 +1428,7 @@
               <w:rPr>
                 <w:sz w:val="17"/>
               </w:rPr>
-              <w:t>Do 2 bạn cùng sửa vào cùng 1 dòng trong cùng 1 file (thường là file tài liệu hoặc shared).</w:t>
+              <w:t>Do 2 bạn cùng sửa vào cùng 1 dòng trong file shared hoặc tài liệu.</w:t>
             </w:r>
           </w:p>
         </w:tc>

</xml_diff>

<commit_message>
feat: pivot project topic to Autonomous Cyber Threat Intelligence (CTI) AI Agent
</commit_message>
<xml_diff>
--- a/docs/HUONG_DAN_DIEU_KHIEN_AGENT_DONG_BO.docx
+++ b/docs/HUONG_DAN_DIEU_KHIEN_AGENT_DONG_BO.docx
@@ -24,11 +24,11 @@
         <w:rPr>
           <w:b/>
           <w:color w:val="102C57"/>
-          <w:sz w:val="27"/>
+          <w:sz w:val="26"/>
         </w:rPr>
         <w:t>HƯỚNG DẪN THIẾT LẬP, ĐIỀU KHIỂN &amp; TỰ ĐỘNG HÓA</w:t>
         <w:br/>
-        <w:t>ĐỒNG BỘ MULTI-AGENT (PHÚC - KHANG - LÂM)</w:t>
+        <w:t>MULTI-AGENT THREAT INTELLIGENCE (PHÚC - KHANG - LÂM)</w:t>
       </w:r>
     </w:p>
     <w:tbl>
@@ -61,11 +61,11 @@
                 <w:b/>
                 <w:color w:val="00468C"/>
               </w:rPr>
-              <w:t>MÔ HÌNH HỢP NHẤT '3 MÁY - 1 BỘ NÃO CHUNG':</w:t>
+              <w:t>MÔ HÌNH HỢP NHẤT '3 MÁY - 1 BỘ NÃO CHUNG' (ĐỀ TÀI CTI):</w:t>
               <w:br/>
             </w:r>
             <w:r>
-              <w:t>Hệ thống được thiết kế theo cơ chế GitOps tự động hóa 100%: Mỗi thành viên sở hữu 1 thư mục riêng, tự động nhận diện danh tính qua file 'identity.txt', tự động kéo code mới trước khi làm việc, tự động chặn sửa file của bạn mình và tự động hỏi đẩy code lên GitHub sau khi hoàn thành.</w:t>
+              <w:t>Hệ thống tự động hóa chu trình Cyber Threat Intelligence: Lâm xây dựng Pipeline cào dữ liệu đa nguồn -&gt; Phúc phụ trách Multi-Agent bóc tách IOC và ánh xạ MITRE ATT&amp;CK -&gt; Khang làm giàu dữ liệu qua VirusTotal/AbuseIPDB và chuẩn hóa STIX 2.1. Mỗi thành viên có thư mục riêng, tự động nhận diện danh tính qua 'identity.txt' và tự động đồng bộ qua Git.</w:t>
               <w:br/>
             </w:r>
             <w:r>
@@ -95,11 +95,6 @@
           <w:sz w:val="25"/>
         </w:rPr>
         <w:t>1. HƯỚNG DẪN CÀI ĐẶT &amp; KẾT NỐI CHO MÁY CỦA PHÚC VÀ KHANG (TỪ A ĐẾN Z)</w:t>
-      </w:r>
-    </w:p>
-    <w:p>
-      <w:r>
-        <w:t>Lâm chỉ cần gửi tài liệu này cho Phúc và Khang, hai bạn làm lần lượt theo 5 bước chuẩn hóa dưới đây:</w:t>
       </w:r>
     </w:p>
     <w:tbl>
@@ -180,7 +175,7 @@
               <w:rPr>
                 <w:sz w:val="17"/>
               </w:rPr>
-              <w:t>Bước 1: Cài đặt công cụ</w:t>
+              <w:t>Bước 1: Cài đặt môi trường</w:t>
             </w:r>
           </w:p>
         </w:tc>
@@ -200,11 +195,11 @@
               <w:rPr>
                 <w:sz w:val="17"/>
               </w:rPr>
-              <w:t>1. Cài đặt Python 3.11+ trên máy (tích chọn 'Add python.exe to PATH').</w:t>
+              <w:t>1. Cài đặt Python 3.11+ trên máy.</w:t>
               <w:br/>
               <w:t>2. Cài đặt Git (git-scm.com).</w:t>
               <w:br/>
-              <w:t>3. Tải và cài đặt Antigravity IDE (đăng nhập bằng tài khoản Google).</w:t>
+              <w:t>3. Tải và cài đặt Antigravity IDE (đăng nhập tài khoản Google).</w:t>
             </w:r>
           </w:p>
         </w:tc>
@@ -224,7 +219,7 @@
               <w:rPr>
                 <w:sz w:val="17"/>
               </w:rPr>
-              <w:t>Môi trường máy tính sẵn sàng chạy Python, Git và Antigravity.</w:t>
+              <w:t>Môi trường sẵn sàng chạy Python, Git và Antigravity.</w:t>
             </w:r>
           </w:p>
         </w:tc>
@@ -266,11 +261,11 @@
               <w:rPr>
                 <w:sz w:val="17"/>
               </w:rPr>
-              <w:t>Mở Terminal (hoặc PowerShell), gõ lệnh:</w:t>
+              <w:t>Mở Terminal, gõ lệnh:</w:t>
               <w:br/>
               <w:t>git clone https://github.com/newiexk-cyber/ai-devsecops-agent.git</w:t>
               <w:br/>
-              <w:t>Sau đó mở Antigravity IDE -&gt; Chọn 'File -&gt; Open Folder' -&gt; Chọn thư mục dự án vừa clone.</w:t>
+              <w:t>Sau đó mở Antigravity IDE -&gt; Chọn 'File -&gt; Open Folder' -&gt; Chọn thư mục dự án.</w:t>
             </w:r>
           </w:p>
         </w:tc>
@@ -290,7 +285,7 @@
               <w:rPr>
                 <w:sz w:val="17"/>
               </w:rPr>
-              <w:t>Toàn bộ mã nguồn, cấu trúc thư mục và tài liệu được kéo về máy.</w:t>
+              <w:t>Toàn bộ mã nguồn, giao ước schemas và tài liệu kéo về máy.</w:t>
             </w:r>
           </w:p>
         </w:tc>
@@ -312,7 +307,7 @@
               <w:rPr>
                 <w:sz w:val="17"/>
               </w:rPr>
-              <w:t>Bước 3: Tạo Thẻ Căn Cước (Quan trọng nhất)</w:t>
+              <w:t>Bước 3: Tạo Thẻ Căn Cước</w:t>
             </w:r>
           </w:p>
         </w:tc>
@@ -332,13 +327,13 @@
               <w:rPr>
                 <w:sz w:val="17"/>
               </w:rPr>
-              <w:t>Mở thư mục '.agents/' trong dự án, tạo một file mới tên là 'identity.txt':</w:t>
+              <w:t>Trong thư mục '.agents/', tạo file 'identity.txt':</w:t>
               <w:br/>
-              <w:t>• Trên máy PHÚC: Gõ đúng chữ: phuc</w:t>
+              <w:t>• Trên máy PHÚC: Gõ chữ: phuc</w:t>
               <w:br/>
-              <w:t>• Trên máy KHANG: Gõ đúng chữ: khang</w:t>
+              <w:t>• Trên máy KHANG: Gõ chữ: khang</w:t>
               <w:br/>
-              <w:t>(File này được .gitignore bỏ qua, không sợ đè nhau lên GitHub).</w:t>
+              <w:t>(File này được .gitignore bỏ qua, lưu cục bộ độc lập).</w:t>
             </w:r>
           </w:p>
         </w:tc>
@@ -358,7 +353,7 @@
               <w:rPr>
                 <w:sz w:val="17"/>
               </w:rPr>
-              <w:t>Agent trên máy Phúc/Khang tự động nhận diện danh tính vĩnh viễn, không bao giờ phải xưng tên lại!</w:t>
+              <w:t>Agent tự động nhận diện Phúc (AI Core) hoặc Khang (Threat Intel) vĩnh viễn, không cần giới thiệu lại!</w:t>
             </w:r>
           </w:p>
         </w:tc>
@@ -422,7 +417,7 @@
               <w:rPr>
                 <w:sz w:val="17"/>
               </w:rPr>
-              <w:t>Cài đặt xong LangGraph, Semgrep, FastAPI, PyGithub sẵn sàng chạy.</w:t>
+              <w:t>Cài đặt xong LangGraph, Pydantic, FastAPI, Pandas, Matplotlib...</w:t>
             </w:r>
           </w:p>
         </w:tc>
@@ -464,7 +459,7 @@
               <w:rPr>
                 <w:sz w:val="17"/>
               </w:rPr>
-              <w:t>Mở khung Chat Antigravity lên và gõ lệnh kích hoạt đầu tiên:</w:t>
+              <w:t>Mở khung Chat Antigravity lên và gõ:</w:t>
               <w:br/>
               <w:t>"Chào Anti, hãy kiểm tra danh tính của tôi và đọc file .agents/AGENTS.md để bắt đầu hỗ trợ tôi nhé!"</w:t>
             </w:r>
@@ -486,7 +481,7 @@
               <w:rPr>
                 <w:sz w:val="17"/>
               </w:rPr>
-              <w:t>Anti chào đúng tên (Phúc/Khang), xác nhận đúng thư mục và kế hoạch tuần!</w:t>
+              <w:t>Anti chào đúng tên (Phúc/Khang), nhận diện đúng thư mục và kế hoạch tuần CTI!</w:t>
             </w:r>
           </w:p>
         </w:tc>
@@ -508,11 +503,6 @@
           <w:sz w:val="25"/>
         </w:rPr>
         <w:t>2. BỐN CƠ CHẾ TỰ ĐỘNG HÓA TRONG SUỐT QUÁ TRÌNH LÀM VIỆC</w:t>
-      </w:r>
-    </w:p>
-    <w:p>
-      <w:r>
-        <w:t>Sau khi thiết lập xong ở Bước 1, hệ thống vận hành tự động 100% theo chu trình khép kín:</w:t>
       </w:r>
     </w:p>
     <w:tbl>
@@ -593,7 +583,7 @@
               <w:rPr>
                 <w:sz w:val="17"/>
               </w:rPr>
-              <w:t>1. Tự nhận diện danh tính (Zero Prompt ID)</w:t>
+              <w:t>1. Tự nhận diện danh tính</w:t>
             </w:r>
           </w:p>
         </w:tc>
@@ -613,7 +603,7 @@
               <w:rPr>
                 <w:sz w:val="17"/>
               </w:rPr>
-              <w:t>Mỗi khi mở Antigravity, Agent tự động đọc '.agents/identity.txt'. Biết ngay Phúc phụ trách AI Core, Khang phụ trách Security, Lâm phụ trách DevOps.</w:t>
+              <w:t>Agent tự đọc '.agents/identity.txt'. Biết ngay Phúc phụ trách AI Core, Khang phụ trách Threat Intel, Lâm phụ trách Data Pipeline &amp; Dashboard.</w:t>
             </w:r>
           </w:p>
         </w:tc>
@@ -675,7 +665,7 @@
               <w:rPr>
                 <w:sz w:val="17"/>
               </w:rPr>
-              <w:t>Khi người dùng yêu cầu làm tính năng mới đầu ngày, Agent tự động kích hoạt 'git pull origin main --rebase' để nạp toàn bộ code mới nhất của các bạn.</w:t>
+              <w:t>Mỗi khi bắt đầu làm tính năng mới, Agent tự chạy 'git pull origin main --rebase' để nạp toàn bộ code mới nhất của các bạn.</w:t>
             </w:r>
           </w:p>
         </w:tc>
@@ -695,7 +685,7 @@
               <w:rPr>
                 <w:sz w:val="17"/>
               </w:rPr>
-              <w:t>Đảm bảo code trên máy luôn mới nhất, không bao giờ bị lệch nhịp.</w:t>
+              <w:t>Mã nguồn trên máy luôn mới nhất, không bao giờ bị lệch nhịp.</w:t>
             </w:r>
           </w:p>
         </w:tc>
@@ -737,7 +727,7 @@
               <w:rPr>
                 <w:sz w:val="17"/>
               </w:rPr>
-              <w:t>Agent của Phúc chỉ code trong 'src/core/'. Agent của Khang chỉ code trong 'src/security/'. Agent của Lâm chỉ code trong 'src/automation/'. Nếu người dùng lỡ bảo sửa file bạn mình, Agent lập tức từ chối.</w:t>
+              <w:t>Phúc chỉ code trong 'src/core/'. Khang chỉ code trong 'src/security/'. Lâm chỉ code trong 'src/automation/'. Nếu lỡ bảo sửa file bạn mình, Agent lập tức từ chối.</w:t>
             </w:r>
           </w:p>
         </w:tc>
@@ -799,7 +789,7 @@
               <w:rPr>
                 <w:sz w:val="17"/>
               </w:rPr>
-              <w:t>Sau khi viết xong code và test ổn định, Agent tự động hỏi: 'Tôi đã hoàn thành code. Bạn có muốn tôi commit và đẩy lên nhánh feat/[tên]-dev trên GitHub không?'</w:t>
+              <w:t>Sau khi viết xong code và test ổn định, Agent tự hỏi: 'Tôi đã hoàn thành code. Bạn có muốn tôi commit và đẩy lên nhánh feat/[tên]-dev trên GitHub không?'</w:t>
             </w:r>
           </w:p>
         </w:tc>
@@ -1029,7 +1019,7 @@
           <w:color w:val="102C57"/>
           <w:sz w:val="25"/>
         </w:rPr>
-        <w:t>4. BỘ CÂU LỆNH PROMPT MẪU CHO TỪNG BẠN (COPY DÙNG HÀNG NGÀY)</w:t>
+        <w:t>4. BỘ CÂU LỆNH PROMPT MẪU CHO ĐỀ TÀI THREAT INTEL (CTI)</w:t>
       </w:r>
     </w:p>
     <w:tbl>
@@ -1132,7 +1122,7 @@
               <w:rPr>
                 <w:sz w:val="17"/>
               </w:rPr>
-              <w:t>Viết code LangGraph tuần này</w:t>
+              <w:t>Viết Agent bóc tách IOC &amp; MITRE</w:t>
             </w:r>
           </w:p>
         </w:tc>
@@ -1152,7 +1142,7 @@
               <w:rPr>
                 <w:sz w:val="17"/>
               </w:rPr>
-              <w:t>"Hãy kiểm tra file docs/DACN.docx xem nhiệm vụ tuần này của tôi. Sau đó viết code trong src/core/ để xây dựng StateGraph lọc cảnh báo ảo, tuân thủ đúng định dạng đầu vào ScannerOutput và đầu ra AgentRunOutput trong shared/schemas.py!"</w:t>
+              <w:t>"Hãy kiểm tra file docs/DACN.docx xem nhiệm vụ tuần này của tôi. Sau đó viết code trong src/core/ để xây dựng LangGraph StateGraph bóc tách các IOC (IP, Domain, Hash, CVE) từ RawThreatData và ánh xạ sang ma trận MITRE ATT&amp;CK, xuất dữ liệu đúng chuẩn ExtractedIOC trong shared/schemas.py!"</w:t>
             </w:r>
           </w:p>
         </w:tc>
@@ -1176,7 +1166,7 @@
               </w:rPr>
               <w:t>🛡️ KHANG</w:t>
               <w:br/>
-              <w:t>(Security)</w:t>
+              <w:t>(Threat Intel)</w:t>
             </w:r>
           </w:p>
         </w:tc>
@@ -1196,7 +1186,7 @@
               <w:rPr>
                 <w:sz w:val="17"/>
               </w:rPr>
-              <w:t>Viết script quét Semgrep</w:t>
+              <w:t>Tích hợp API làm giàu dữ liệu</w:t>
             </w:r>
           </w:p>
         </w:tc>
@@ -1216,7 +1206,7 @@
               <w:rPr>
                 <w:sz w:val="17"/>
               </w:rPr>
-              <w:t>"Hãy hướng dẫn tôi viết script trong src/security/semgrep_runner.py để gọi Semgrep CLI quét mã nguồn, bóc tách lỗi CWE-89 và CWE-79, rồi xuất kết quả đúng chuẩn RawAlert trong shared/schemas.py!"</w:t>
+              <w:t>"Hãy hướng dẫn tôi viết module trong src/security/enrichment_service.py để gọi API VirusTotal và AbuseIPDB kiểm tra danh tiếng của các IOC do Phúc bóc tách ra, rồi đóng gói đúng chuẩn EnrichedIOC trong shared/schemas.py!"</w:t>
             </w:r>
           </w:p>
         </w:tc>
@@ -1240,7 +1230,7 @@
               </w:rPr>
               <w:t>⚙️ LÂM</w:t>
               <w:br/>
-              <w:t>(DevOps/Bot)</w:t>
+              <w:t>(Data Pipeline &amp; Web)</w:t>
             </w:r>
           </w:p>
         </w:tc>
@@ -1260,7 +1250,7 @@
               <w:rPr>
                 <w:sz w:val="17"/>
               </w:rPr>
-              <w:t>Kết nối Webhook với code của Phúc</w:t>
+              <w:t>Xây dựng Collector cào tin tự động</w:t>
             </w:r>
           </w:p>
         </w:tc>
@@ -1280,7 +1270,7 @@
               <w:rPr>
                 <w:sz w:val="17"/>
               </w:rPr>
-              <w:t>"Phúc vừa đẩy code Agent trong src/core/ lên. Hãy đọc code của Phúc, xem cách gọi hàm và viết giúp tôi module trong src/automation/ để nhận kết quả, chạy Unit Test và tạo Pull Request tự động lên GitHub!"</w:t>
+              <w:t>"Hãy hướng dẫn tôi viết module trong src/automation/collectors/ để cào tin tức bảo mật mới nhất từ RSS TheHackerNews và BleepingComputer, đóng gói bài viết thành RawThreatData trong shared/schemas.py để chuyển cho Agent của Phúc phân tích!"</w:t>
             </w:r>
           </w:p>
         </w:tc>
@@ -1312,274 +1302,6 @@
         <w:t>"Anti ơi, hãy ĐỌC (chỉ đọc, không sửa) file của bạn [Tên bạn] tại [Đường dẫn file]. Giải thích cho tôi hàm đó cần tham số đầu vào gì để tôi viết code trong thư mục của tôi gọi sang hàm đó!"</w:t>
       </w:r>
     </w:p>
-    <w:p>
-      <w:pPr>
-        <w:spacing w:after="80"/>
-      </w:pPr>
-    </w:p>
-    <w:p>
-      <w:pPr>
-        <w:spacing w:before="240" w:after="80"/>
-      </w:pPr>
-      <w:r>
-        <w:rPr>
-          <w:b/>
-          <w:color w:val="102C57"/>
-          <w:sz w:val="25"/>
-        </w:rPr>
-        <w:t>5. HƯỚNG DẪN XỬ LÝ SỰ CỐ THƯỜNG GẶP (TROUBLESHOOTING)</w:t>
-      </w:r>
-    </w:p>
-    <w:tbl>
-      <w:tblPr>
-        <w:tblW w:type="auto" w:w="0"/>
-        <w:jc w:val="center"/>
-        <w:tblLook w:firstColumn="1" w:firstRow="1" w:lastColumn="0" w:lastRow="0" w:noHBand="0" w:noVBand="1" w:val="04A0"/>
-      </w:tblPr>
-      <w:tblGrid>
-        <w:gridCol w:w="3312"/>
-        <w:gridCol w:w="3312"/>
-        <w:gridCol w:w="3312"/>
-      </w:tblGrid>
-      <w:tr>
-        <w:tc>
-          <w:tcPr>
-            <w:tcW w:type="dxa" w:w="3312"/>
-            <w:shd w:fill="7C2D12"/>
-          </w:tcPr>
-          <w:p>
-            <w:r>
-              <w:rPr>
-                <w:b/>
-                <w:color w:val="FFFFFF"/>
-                <w:sz w:val="18"/>
-              </w:rPr>
-              <w:t>TÌNH HUỐNG SỰ CỐ</w:t>
-            </w:r>
-          </w:p>
-        </w:tc>
-        <w:tc>
-          <w:tcPr>
-            <w:tcW w:type="dxa" w:w="3312"/>
-            <w:shd w:fill="7C2D12"/>
-          </w:tcPr>
-          <w:p>
-            <w:r>
-              <w:rPr>
-                <w:b/>
-                <w:color w:val="FFFFFF"/>
-                <w:sz w:val="18"/>
-              </w:rPr>
-              <w:t>NGUYÊN NHÂN</w:t>
-            </w:r>
-          </w:p>
-        </w:tc>
-        <w:tc>
-          <w:tcPr>
-            <w:tcW w:type="dxa" w:w="3312"/>
-            <w:shd w:fill="7C2D12"/>
-          </w:tcPr>
-          <w:p>
-            <w:r>
-              <w:rPr>
-                <w:b/>
-                <w:color w:val="FFFFFF"/>
-                <w:sz w:val="18"/>
-              </w:rPr>
-              <w:t>CÁCH XỬ LÝ NHANH</w:t>
-            </w:r>
-          </w:p>
-        </w:tc>
-      </w:tr>
-      <w:tr>
-        <w:tc>
-          <w:tcPr>
-            <w:tcW w:type="dxa" w:w="3312"/>
-            <w:shd w:fill="FFF7ED"/>
-            <w:tcMar>
-              <w:top w:w="50" w:type="dxa"/>
-              <w:bottom w:w="50" w:type="dxa"/>
-              <w:left w:w="70" w:type="dxa"/>
-              <w:right w:w="70" w:type="dxa"/>
-            </w:tcMar>
-          </w:tcPr>
-          <w:p>
-            <w:r>
-              <w:rPr>
-                <w:sz w:val="17"/>
-              </w:rPr>
-              <w:t>Git báo lỗi khi chạy sync.py (Merge Conflict)</w:t>
-            </w:r>
-          </w:p>
-        </w:tc>
-        <w:tc>
-          <w:tcPr>
-            <w:tcW w:type="dxa" w:w="3312"/>
-            <w:shd w:fill="FFF7ED"/>
-            <w:tcMar>
-              <w:top w:w="50" w:type="dxa"/>
-              <w:bottom w:w="50" w:type="dxa"/>
-              <w:left w:w="70" w:type="dxa"/>
-              <w:right w:w="70" w:type="dxa"/>
-            </w:tcMar>
-          </w:tcPr>
-          <w:p>
-            <w:r>
-              <w:rPr>
-                <w:sz w:val="17"/>
-              </w:rPr>
-              <w:t>Do 2 bạn cùng sửa vào cùng 1 dòng trong file shared hoặc tài liệu.</w:t>
-            </w:r>
-          </w:p>
-        </w:tc>
-        <w:tc>
-          <w:tcPr>
-            <w:tcW w:type="dxa" w:w="3312"/>
-            <w:shd w:fill="FFF7ED"/>
-            <w:tcMar>
-              <w:top w:w="50" w:type="dxa"/>
-              <w:bottom w:w="50" w:type="dxa"/>
-              <w:left w:w="70" w:type="dxa"/>
-              <w:right w:w="70" w:type="dxa"/>
-            </w:tcMar>
-          </w:tcPr>
-          <w:p>
-            <w:r>
-              <w:rPr>
-                <w:sz w:val="17"/>
-              </w:rPr>
-              <w:t>Mở file bị đỏ trong VS Code/Antigravity, chọn 'Accept Incoming Change' hoặc 'Accept Current Change', sau đó chạy lại 'python sync.py'.</w:t>
-            </w:r>
-          </w:p>
-        </w:tc>
-      </w:tr>
-      <w:tr>
-        <w:tc>
-          <w:tcPr>
-            <w:tcW w:type="dxa" w:w="3312"/>
-            <w:shd w:fill="FFFFFF"/>
-            <w:tcMar>
-              <w:top w:w="50" w:type="dxa"/>
-              <w:bottom w:w="50" w:type="dxa"/>
-              <w:left w:w="70" w:type="dxa"/>
-              <w:right w:w="70" w:type="dxa"/>
-            </w:tcMar>
-          </w:tcPr>
-          <w:p>
-            <w:r>
-              <w:rPr>
-                <w:sz w:val="17"/>
-              </w:rPr>
-              <w:t>Agent báo: 'Không có quyền sửa file này'</w:t>
-            </w:r>
-          </w:p>
-        </w:tc>
-        <w:tc>
-          <w:tcPr>
-            <w:tcW w:type="dxa" w:w="3312"/>
-            <w:shd w:fill="FFFFFF"/>
-            <w:tcMar>
-              <w:top w:w="50" w:type="dxa"/>
-              <w:bottom w:w="50" w:type="dxa"/>
-              <w:left w:w="70" w:type="dxa"/>
-              <w:right w:w="70" w:type="dxa"/>
-            </w:tcMar>
-          </w:tcPr>
-          <w:p>
-            <w:r>
-              <w:rPr>
-                <w:sz w:val="17"/>
-              </w:rPr>
-              <w:t>Bạn đang yêu cầu Agent sửa file nằm ngoài thư mục của bạn (ví dụ Phúc bảo sửa file của Lâm).</w:t>
-            </w:r>
-          </w:p>
-        </w:tc>
-        <w:tc>
-          <w:tcPr>
-            <w:tcW w:type="dxa" w:w="3312"/>
-            <w:shd w:fill="FFFFFF"/>
-            <w:tcMar>
-              <w:top w:w="50" w:type="dxa"/>
-              <w:bottom w:w="50" w:type="dxa"/>
-              <w:left w:w="70" w:type="dxa"/>
-              <w:right w:w="70" w:type="dxa"/>
-            </w:tcMar>
-          </w:tcPr>
-          <w:p>
-            <w:r>
-              <w:rPr>
-                <w:sz w:val="17"/>
-              </w:rPr>
-              <w:t>Đây là tính năng bảo vệ. Hãy bảo Agent viết code trong thư mục của mình và import hàm của bạn.</w:t>
-            </w:r>
-          </w:p>
-        </w:tc>
-      </w:tr>
-      <w:tr>
-        <w:tc>
-          <w:tcPr>
-            <w:tcW w:type="dxa" w:w="3312"/>
-            <w:shd w:fill="FFF7ED"/>
-            <w:tcMar>
-              <w:top w:w="50" w:type="dxa"/>
-              <w:bottom w:w="50" w:type="dxa"/>
-              <w:left w:w="70" w:type="dxa"/>
-              <w:right w:w="70" w:type="dxa"/>
-            </w:tcMar>
-          </w:tcPr>
-          <w:p>
-            <w:r>
-              <w:rPr>
-                <w:sz w:val="17"/>
-              </w:rPr>
-              <w:t>Nhóm muốn đổi chủ đề đồ án</w:t>
-            </w:r>
-          </w:p>
-        </w:tc>
-        <w:tc>
-          <w:tcPr>
-            <w:tcW w:type="dxa" w:w="3312"/>
-            <w:shd w:fill="FFF7ED"/>
-            <w:tcMar>
-              <w:top w:w="50" w:type="dxa"/>
-              <w:bottom w:w="50" w:type="dxa"/>
-              <w:left w:w="70" w:type="dxa"/>
-              <w:right w:w="70" w:type="dxa"/>
-            </w:tcMar>
-          </w:tcPr>
-          <w:p>
-            <w:r>
-              <w:rPr>
-                <w:sz w:val="17"/>
-              </w:rPr>
-              <w:t>Nhóm thống nhất đổi sang đề tài khác sau buổi gặp giảng viên.</w:t>
-            </w:r>
-          </w:p>
-        </w:tc>
-        <w:tc>
-          <w:tcPr>
-            <w:tcW w:type="dxa" w:w="3312"/>
-            <w:shd w:fill="FFF7ED"/>
-            <w:tcMar>
-              <w:top w:w="50" w:type="dxa"/>
-              <w:bottom w:w="50" w:type="dxa"/>
-              <w:left w:w="70" w:type="dxa"/>
-              <w:right w:w="70" w:type="dxa"/>
-            </w:tcMar>
-          </w:tcPr>
-          <w:p>
-            <w:r>
-              <w:rPr>
-                <w:sz w:val="17"/>
-              </w:rPr>
-              <w:t>1. Lâm sửa lại .agents/AGENTS.md và shared/schemas.py -&gt; Push lên main.</w:t>
-              <w:br/>
-              <w:t>2. Phúc và Khang chạy 'python sync.py' -&gt; Báo Anti nạp lại luật mới là xong ngay!</w:t>
-            </w:r>
-          </w:p>
-        </w:tc>
-      </w:tr>
-    </w:tbl>
     <w:sectPr>
       <w:pgSz w:w="12240" w:h="15840"/>
       <w:pgMar w:top="1080" w:right="1152" w:bottom="1080" w:left="1152" w:header="720" w:footer="720" w:gutter="0"/>

</xml_diff>